<commit_message>
SEO-friendly media filenames based on incident title; shared MediaGallery for user-web; upload timeout + tracing
</commit_message>
<xml_diff>
--- a/srs.docx
+++ b/srs.docx
@@ -8,7 +8,7 @@
         <w:jc w:val="center"/>
       </w:pPr>
       <w:r>
-        <w:t>GeoWatch — Project Specification Document</w:t>
+        <w:t>GeoWatch — Software Requirements Specification</w:t>
       </w:r>
     </w:p>
     <w:p>
@@ -17,8 +17,8 @@
       </w:pPr>
       <w:r>
         <w:rPr>
-          <w:color w:val="646464"/>
-          <w:sz w:val="24"/>
+          <w:color w:val="808080"/>
+          <w:sz w:val="28"/>
         </w:rPr>
         <w:t>Updated Technical Specification &amp; Development Plan</w:t>
       </w:r>
@@ -34,7 +34,7 @@
     </w:p>
     <w:p>
       <w:r>
-        <w:t>GeoWatch is a map-based global conflict and major events visualization platform. The platform allows users to view real-world incidents on an interactive map, filter by date, and explore detailed event timelines with credible source-backed updates.</w:t>
+        <w:t>GeoWatch is a map-based global conflict and major events visualization platform. The platform allows users to view real-world incidents on an interactive map, filter by date, category, domain, and severity, and explore detailed incident timelines with credible source-backed updates. The system supports real-time updates via Server-Sent Events (SSE), a full hierarchical incident taxonomy (17 domains, 162 categories), media uploads (images and videos), polygon zone management, and a comprehensive superadmin console with audit logging.</w:t>
       </w:r>
     </w:p>
     <w:p>
@@ -52,25 +52,14 @@
         <w:tblLook w:firstColumn="1" w:firstRow="1" w:lastColumn="0" w:lastRow="0" w:noHBand="0" w:noVBand="1" w:val="04A0"/>
       </w:tblPr>
       <w:tblGrid>
-        <w:gridCol w:w="2160"/>
-        <w:gridCol w:w="2160"/>
-        <w:gridCol w:w="2160"/>
-        <w:gridCol w:w="2160"/>
+        <w:gridCol w:w="2880"/>
+        <w:gridCol w:w="2880"/>
+        <w:gridCol w:w="2880"/>
       </w:tblGrid>
       <w:tr>
         <w:tc>
           <w:tcPr>
-            <w:tcW w:type="dxa" w:w="2160"/>
-          </w:tcPr>
-          <w:p>
-            <w:r>
-              <w:t>Phase</w:t>
-            </w:r>
-          </w:p>
-        </w:tc>
-        <w:tc>
-          <w:tcPr>
-            <w:tcW w:type="dxa" w:w="2160"/>
+            <w:tcW w:type="dxa" w:w="2880"/>
           </w:tcPr>
           <w:p>
             <w:r>
@@ -80,17 +69,7 @@
         </w:tc>
         <w:tc>
           <w:tcPr>
-            <w:tcW w:type="dxa" w:w="2160"/>
-          </w:tcPr>
-          <w:p>
-            <w:r>
-              <w:t>Screen Focus</w:t>
-            </w:r>
-          </w:p>
-        </w:tc>
-        <w:tc>
-          <w:tcPr>
-            <w:tcW w:type="dxa" w:w="2160"/>
+            <w:tcW w:type="dxa" w:w="2880"/>
           </w:tcPr>
           <w:p>
             <w:r>
@@ -98,21 +77,85 @@
             </w:r>
           </w:p>
         </w:tc>
+        <w:tc>
+          <w:tcPr>
+            <w:tcW w:type="dxa" w:w="2880"/>
+          </w:tcPr>
+          <w:p>
+            <w:r>
+              <w:t>Stack</w:t>
+            </w:r>
+          </w:p>
+        </w:tc>
       </w:tr>
       <w:tr>
         <w:tc>
           <w:tcPr>
-            <w:tcW w:type="dxa" w:w="2160"/>
+            <w:tcW w:type="dxa" w:w="2880"/>
           </w:tcPr>
           <w:p>
             <w:r>
-              <w:t>Phase 1 (MVP)</w:t>
+              <w:t>Backend API</w:t>
             </w:r>
           </w:p>
         </w:tc>
         <w:tc>
           <w:tcPr>
-            <w:tcW w:type="dxa" w:w="2160"/>
+            <w:tcW w:type="dxa" w:w="2880"/>
+          </w:tcPr>
+          <w:p>
+            <w:r>
+              <w:t>Complete</w:t>
+            </w:r>
+          </w:p>
+        </w:tc>
+        <w:tc>
+          <w:tcPr>
+            <w:tcW w:type="dxa" w:w="2880"/>
+          </w:tcPr>
+          <w:p>
+            <w:r>
+              <w:t>Node.js 22 + Express 4 + PostgreSQL 16 + PostGIS 3</w:t>
+            </w:r>
+          </w:p>
+        </w:tc>
+      </w:tr>
+      <w:tr>
+        <w:tc>
+          <w:tcPr>
+            <w:tcW w:type="dxa" w:w="2880"/>
+          </w:tcPr>
+          <w:p>
+            <w:r>
+              <w:t>Admin Dashboard</w:t>
+            </w:r>
+          </w:p>
+        </w:tc>
+        <w:tc>
+          <w:tcPr>
+            <w:tcW w:type="dxa" w:w="2880"/>
+          </w:tcPr>
+          <w:p>
+            <w:r>
+              <w:t>Complete</w:t>
+            </w:r>
+          </w:p>
+        </w:tc>
+        <w:tc>
+          <w:tcPr>
+            <w:tcW w:type="dxa" w:w="2880"/>
+          </w:tcPr>
+          <w:p>
+            <w:r>
+              <w:t>React 18 + Vite + MapLibre GL JS</w:t>
+            </w:r>
+          </w:p>
+        </w:tc>
+      </w:tr>
+      <w:tr>
+        <w:tc>
+          <w:tcPr>
+            <w:tcW w:type="dxa" w:w="2880"/>
           </w:tcPr>
           <w:p>
             <w:r>
@@ -122,21 +165,21 @@
         </w:tc>
         <w:tc>
           <w:tcPr>
-            <w:tcW w:type="dxa" w:w="2160"/>
+            <w:tcW w:type="dxa" w:w="2880"/>
           </w:tcPr>
           <w:p>
             <w:r>
-              <w:t>Desktop primary, mobile responsive</w:t>
+              <w:t>Complete</w:t>
             </w:r>
           </w:p>
         </w:tc>
         <w:tc>
           <w:tcPr>
-            <w:tcW w:type="dxa" w:w="2160"/>
+            <w:tcW w:type="dxa" w:w="2880"/>
           </w:tcPr>
           <w:p>
             <w:r>
-              <w:t>Current</w:t>
+              <w:t>React 18 + Vite + MapLibre GL JS</w:t>
             </w:r>
           </w:p>
         </w:tc>
@@ -144,89 +187,36 @@
       <w:tr>
         <w:tc>
           <w:tcPr>
-            <w:tcW w:type="dxa" w:w="2160"/>
+            <w:tcW w:type="dxa" w:w="2880"/>
           </w:tcPr>
           <w:p>
             <w:r>
-              <w:t>Phase 1 (MVP)</w:t>
+              <w:t>Superadmin Console</w:t>
             </w:r>
           </w:p>
         </w:tc>
         <w:tc>
           <w:tcPr>
-            <w:tcW w:type="dxa" w:w="2160"/>
+            <w:tcW w:type="dxa" w:w="2880"/>
           </w:tcPr>
           <w:p>
             <w:r>
-              <w:t>Admin Dashboard</w:t>
+              <w:t>Complete</w:t>
             </w:r>
           </w:p>
         </w:tc>
         <w:tc>
           <w:tcPr>
-            <w:tcW w:type="dxa" w:w="2160"/>
+            <w:tcW w:type="dxa" w:w="2880"/>
           </w:tcPr>
           <w:p>
             <w:r>
-              <w:t>Desktop primary, mobile responsive</w:t>
-            </w:r>
-          </w:p>
-        </w:tc>
-        <w:tc>
-          <w:tcPr>
-            <w:tcW w:type="dxa" w:w="2160"/>
-          </w:tcPr>
-          <w:p>
-            <w:r>
-              <w:t>Current</w:t>
-            </w:r>
-          </w:p>
-        </w:tc>
-      </w:tr>
-      <w:tr>
-        <w:tc>
-          <w:tcPr>
-            <w:tcW w:type="dxa" w:w="2160"/>
-          </w:tcPr>
-          <w:p>
-            <w:r>
-              <w:t>Phase 2</w:t>
-            </w:r>
-          </w:p>
-        </w:tc>
-        <w:tc>
-          <w:tcPr>
-            <w:tcW w:type="dxa" w:w="2160"/>
-          </w:tcPr>
-          <w:p>
-            <w:r>
-              <w:t>Native Android App</w:t>
-            </w:r>
-          </w:p>
-        </w:tc>
-        <w:tc>
-          <w:tcPr>
-            <w:tcW w:type="dxa" w:w="2160"/>
-          </w:tcPr>
-          <w:p>
-            <w:r>
-              <w:t>Mobile native (Play Store)</w:t>
-            </w:r>
-          </w:p>
-        </w:tc>
-        <w:tc>
-          <w:tcPr>
-            <w:tcW w:type="dxa" w:w="2160"/>
-          </w:tcPr>
-          <w:p>
-            <w:r>
-              <w:t>Future</w:t>
+              <w:t>React 18 + Vite + MapLibre GL JS</w:t>
             </w:r>
           </w:p>
         </w:tc>
       </w:tr>
     </w:tbl>
-    <w:p/>
     <w:p>
       <w:pPr>
         <w:pStyle w:val="Heading1"/>
@@ -244,25 +234,26 @@
       </w:r>
     </w:p>
     <w:p>
-      <w:pPr>
-        <w:pStyle w:val="ListBullet"/>
-      </w:pPr>
       <w:r>
         <w:t>React 18 + Vite (build tool)</w:t>
       </w:r>
     </w:p>
     <w:p>
-      <w:pPr>
-        <w:pStyle w:val="ListBullet"/>
-      </w:pPr>
       <w:r>
         <w:t>MapLibre GL JS (map rendering)</w:t>
       </w:r>
     </w:p>
     <w:p>
-      <w:pPr>
-        <w:pStyle w:val="ListBullet"/>
-      </w:pPr>
+      <w:r>
+        <w:t>Lucide React (SVG icons)</w:t>
+      </w:r>
+    </w:p>
+    <w:p>
+      <w:r>
+        <w:t>Framer Motion (animations, user-web only)</w:t>
+      </w:r>
+    </w:p>
+    <w:p>
       <w:r>
         <w:t>Responsive design (desktop primary, mobile adaptive)</w:t>
       </w:r>
@@ -276,54 +267,46 @@
       </w:r>
     </w:p>
     <w:p>
-      <w:pPr>
-        <w:pStyle w:val="ListBullet"/>
-      </w:pPr>
       <w:r>
-        <w:t>Node.js + Express 4 (REST API)</w:t>
+        <w:t>Node.js 22 + Express 4 (REST API)</w:t>
       </w:r>
     </w:p>
     <w:p>
-      <w:pPr>
-        <w:pStyle w:val="ListBullet"/>
-      </w:pPr>
       <w:r>
-        <w:t>Socket.IO (backend-ready for real-time, frontend post-MVP)</w:t>
+        <w:t>Server-Sent Events (SSE) for real-time updates</w:t>
       </w:r>
     </w:p>
     <w:p>
-      <w:pPr>
-        <w:pStyle w:val="ListBullet"/>
-      </w:pPr>
       <w:r>
         <w:t>JWT (jsonwebtoken) + bcryptjs (authentication)</w:t>
       </w:r>
     </w:p>
     <w:p>
-      <w:pPr>
-        <w:pStyle w:val="ListBullet"/>
-      </w:pPr>
       <w:r>
         <w:t>Zod (input validation)</w:t>
       </w:r>
     </w:p>
     <w:p>
-      <w:pPr>
-        <w:pStyle w:val="ListBullet"/>
-      </w:pPr>
       <w:r>
         <w:t>express-rate-limit (rate limiting)</w:t>
       </w:r>
     </w:p>
     <w:p>
-      <w:pPr>
-        <w:pStyle w:val="ListBullet"/>
-      </w:pPr>
       <w:r>
         <w:t>cors (cross-origin handling)</w:t>
       </w:r>
     </w:p>
     <w:p>
+      <w:r>
+        <w:t>Sharp (image processing: WebP + thumbnail)</w:t>
+      </w:r>
+    </w:p>
+    <w:p>
+      <w:r>
+        <w:t>Multer (file upload handling)</w:t>
+      </w:r>
+    </w:p>
+    <w:p>
       <w:pPr>
         <w:pStyle w:val="Heading2"/>
       </w:pPr>
@@ -332,35 +315,28 @@
       </w:r>
     </w:p>
     <w:p>
-      <w:pPr>
-        <w:pStyle w:val="ListBullet"/>
-      </w:pPr>
       <w:r>
         <w:t>PostgreSQL 16 + PostGIS 3 (geospatial support)</w:t>
       </w:r>
     </w:p>
     <w:p>
-      <w:pPr>
-        <w:pStyle w:val="ListBullet"/>
-      </w:pPr>
       <w:r>
-        <w:t>UUID v4 primary keys</w:t>
+        <w:t>UUID v4 primary keys (except taxonomy tables use SERIAL)</w:t>
       </w:r>
     </w:p>
     <w:p>
-      <w:pPr>
-        <w:pStyle w:val="ListBullet"/>
-      </w:pPr>
       <w:r>
         <w:t>UTC timestamp storage, local time display</w:t>
       </w:r>
     </w:p>
     <w:p>
-      <w:pPr>
-        <w:pStyle w:val="ListBullet"/>
-      </w:pPr>
       <w:r>
-        <w:t>Full-text search ready (tsvector/tsquery, Post-MVP)</w:t>
+        <w:t>Full-text search via tsvector/tsquery</w:t>
+      </w:r>
+    </w:p>
+    <w:p>
+      <w:r>
+        <w:t>Immutable audit logging</w:t>
       </w:r>
     </w:p>
     <w:p>
@@ -381,60 +357,35 @@
         <w:pStyle w:val="Heading2"/>
       </w:pPr>
       <w:r>
-        <w:t>3.5 Hosting (Development)</w:t>
+        <w:t>3.5 File Storage</w:t>
       </w:r>
     </w:p>
     <w:p>
       <w:r>
-        <w:t>All services run locally on Pop!_OS development machine. Zero cost.</w:t>
+        <w:t>Development: Local disk (./uploads/) via abstracted storage interface</w:t>
       </w:r>
     </w:p>
     <w:p>
-      <w:pPr>
-        <w:pStyle w:val="Heading2"/>
-      </w:pPr>
       <w:r>
-        <w:t>3.6 Hosting (Production/Launch)</w:t>
+        <w:t>Production: Cloudflare R2 (flip STORAGE_PROVIDER=r2 env var)</w:t>
       </w:r>
     </w:p>
     <w:p>
       <w:pPr>
-        <w:pStyle w:val="ListBullet"/>
+        <w:pStyle w:val="Heading2"/>
       </w:pPr>
       <w:r>
-        <w:t>Backend API + Database: Oracle Cloud Free Tier (ARM instance, 24GB RAM, 200GB storage)</w:t>
+        <w:t>3.6 Hosting</w:t>
       </w:r>
     </w:p>
     <w:p>
-      <w:pPr>
-        <w:pStyle w:val="ListBullet"/>
-      </w:pPr>
       <w:r>
-        <w:t>Frontend websites: Vercel or Netlify (free tier)</w:t>
+        <w:t>Development: All services run locally on Pop!_OS. Zero cost.</w:t>
       </w:r>
     </w:p>
     <w:p>
-      <w:pPr>
-        <w:pStyle w:val="ListBullet"/>
-      </w:pPr>
       <w:r>
-        <w:t>Map tiles: Martin on VPS (same Oracle instance)</w:t>
-      </w:r>
-    </w:p>
-    <w:p>
-      <w:pPr>
-        <w:pStyle w:val="ListBullet"/>
-      </w:pPr>
-      <w:r>
-        <w:t>Domain: Freenom or cheap registrar (~$1-10/year)</w:t>
-      </w:r>
-    </w:p>
-    <w:p>
-      <w:pPr>
-        <w:pStyle w:val="ListBullet"/>
-      </w:pPr>
-      <w:r>
-        <w:t>SSL/HTTPS: Cloudflare (free) + Let's Encrypt</w:t>
+        <w:t>Production: Oracle Cloud Free Tier (ARM instance) + Vercel/Netlify (free tier) + Cloudflare (free SSL)</w:t>
       </w:r>
     </w:p>
     <w:p>
@@ -447,56 +398,18 @@
     </w:p>
     <w:p>
       <w:r>
-        <w:t>Client-Server architecture with separate frontend builds for public users and administrators, sharing a single backend API and database.</w:t>
+        <w:t>Client-Server architecture with three separate frontend builds (public users, admin staff, superadmin operators), sharing a single backend API and database.</w:t>
       </w:r>
     </w:p>
     <w:p>
       <w:r>
-        <w:rPr>
-          <w:b/>
-        </w:rPr>
-        <w:t xml:space="preserve">Public User → </w:t>
-      </w:r>
-      <w:r>
-        <w:t xml:space="preserve">Website (React + MapLibre) → </w:t>
-      </w:r>
-      <w:r>
-        <w:rPr>
-          <w:b/>
-        </w:rPr>
-        <w:t xml:space="preserve">Node API → </w:t>
-      </w:r>
-      <w:r>
-        <w:t>PostgreSQL + PostGIS</w:t>
+        <w:t>Public User → Website (React + MapLibre) → Node API → PostgreSQL + PostGIS</w:t>
         <w:br/>
-      </w:r>
-      <w:r>
-        <w:rPr>
-          <w:b/>
-        </w:rPr>
-        <w:t xml:space="preserve">Admin User → </w:t>
-      </w:r>
-      <w:r>
-        <w:t xml:space="preserve">Dashboard (React + MapLibre) → </w:t>
-      </w:r>
-      <w:r>
-        <w:rPr>
-          <w:b/>
-        </w:rPr>
-        <w:t xml:space="preserve">Node API → </w:t>
-      </w:r>
-      <w:r>
-        <w:t>PostgreSQL + PostGIS</w:t>
+        <w:t>Admin User → Dashboard (React + MapLibre) → Node API → PostgreSQL + PostGIS</w:t>
         <w:br/>
-      </w:r>
-      <w:r>
-        <w:rPr>
-          <w:b/>
-        </w:rPr>
-        <w:t xml:space="preserve">Map Tiles → </w:t>
-      </w:r>
-      <w:r>
-        <w:t>Martin Server (.mbtiles) → served to both frontends</w:t>
+        <w:t>Superadmin → Console (React + MapLibre) → Node API → PostgreSQL + PostGIS</w:t>
+        <w:br/>
+        <w:t>Map Tiles → Martin Server (.mbtiles) → served to all frontends</w:t>
       </w:r>
     </w:p>
     <w:p>
@@ -532,7 +445,7 @@
         <w:t xml:space="preserve">FR-2: </w:t>
       </w:r>
       <w:r>
-        <w:t>Display event markers (dots) on the map</w:t>
+        <w:t>Display incident markers (dots) on the map</w:t>
       </w:r>
     </w:p>
     <w:p>
@@ -546,7 +459,7 @@
         <w:t xml:space="preserve">FR-3: </w:t>
       </w:r>
       <w:r>
-        <w:t>Marker color represents event category</w:t>
+        <w:t>Marker color represents incident domain</w:t>
       </w:r>
     </w:p>
     <w:p>
@@ -560,7 +473,7 @@
         <w:t xml:space="preserve">FR-4: </w:t>
       </w:r>
       <w:r>
-        <w:t>Marker size represents event severity (1-5)</w:t>
+        <w:t>Marker size represents incident severity (1-5)</w:t>
       </w:r>
     </w:p>
     <w:p>
@@ -574,7 +487,7 @@
         <w:t xml:space="preserve">FR-5: </w:t>
       </w:r>
       <w:r>
-        <w:t>Markers cluster automatically at lower zoom levels</w:t>
+        <w:t>Markers cluster automatically at lower zoom levels (Post-MVP)</w:t>
       </w:r>
     </w:p>
     <w:p>
@@ -588,7 +501,7 @@
         <w:t xml:space="preserve">FR-6: </w:t>
       </w:r>
       <w:r>
-        <w:t>Date selector with today as default</w:t>
+        <w:t>Date range selector with today as default</w:t>
       </w:r>
     </w:p>
     <w:p>
@@ -602,7 +515,7 @@
         <w:t xml:space="preserve">FR-7: </w:t>
       </w:r>
       <w:r>
-        <w:t>Only events active on selected date are visible</w:t>
+        <w:t>Only incidents active on selected date range are visible</w:t>
       </w:r>
     </w:p>
     <w:p>
@@ -616,7 +529,7 @@
         <w:t xml:space="preserve">FR-8: </w:t>
       </w:r>
       <w:r>
-        <w:t>Ongoing events persist across dates until resolved</w:t>
+        <w:t>Ongoing incidents persist across dates until resolved</w:t>
       </w:r>
     </w:p>
     <w:p>
@@ -644,7 +557,7 @@
         <w:t xml:space="preserve">FR-10: </w:t>
       </w:r>
       <w:r>
-        <w:t>Clicking marker opens event detail panel</w:t>
+        <w:t>Clicking marker opens incident detail panel</w:t>
       </w:r>
     </w:p>
     <w:p>
@@ -658,7 +571,7 @@
         <w:t xml:space="preserve">FR-11: </w:t>
       </w:r>
       <w:r>
-        <w:t>Panel displays event metadata (title, status, category, severity)</w:t>
+        <w:t>Panel displays incident metadata (title, status, category, severity, verification)</w:t>
       </w:r>
     </w:p>
     <w:p>
@@ -714,7 +627,7 @@
         <w:t xml:space="preserve">FR-15: </w:t>
       </w:r>
       <w:r>
-        <w:t>Embedded sources display within event timeline (tabbed interface)</w:t>
+        <w:t>Embedded sources display within incident timeline</w:t>
       </w:r>
     </w:p>
     <w:p>
@@ -742,7 +655,7 @@
         <w:t xml:space="preserve">FR-17: </w:t>
       </w:r>
       <w:r>
-        <w:t>Live Mode pushes real-time updates (Post-MVP)</w:t>
+        <w:t>Live Mode pushes real-time updates via SSE</w:t>
       </w:r>
     </w:p>
     <w:p>
@@ -756,7 +669,7 @@
         <w:t xml:space="preserve">FR-18: </w:t>
       </w:r>
       <w:r>
-        <w:t>Real-time updates include new events and status changes (Post-MVP)</w:t>
+        <w:t>Real-time updates include new incidents and status changes</w:t>
       </w:r>
     </w:p>
     <w:p>
@@ -770,7 +683,7 @@
         <w:t xml:space="preserve">FR-19: </w:t>
       </w:r>
       <w:r>
-        <w:t>Real-time updates via Socket.IO (backend ready, frontend Post-MVP)</w:t>
+        <w:t>Real-time updates via Server-Sent Events</w:t>
       </w:r>
     </w:p>
     <w:p>
@@ -784,7 +697,7 @@
         <w:t xml:space="preserve">FR-20: </w:t>
       </w:r>
       <w:r>
-        <w:t>Admins can create new events</w:t>
+        <w:t>Admins can create new incidents</w:t>
       </w:r>
     </w:p>
     <w:p>
@@ -798,7 +711,7 @@
         <w:t xml:space="preserve">FR-21: </w:t>
       </w:r>
       <w:r>
-        <w:t>Admins can add timeline updates to events</w:t>
+        <w:t>Admins can add timeline updates to incidents</w:t>
       </w:r>
     </w:p>
     <w:p>
@@ -812,7 +725,7 @@
         <w:t xml:space="preserve">FR-22: </w:t>
       </w:r>
       <w:r>
-        <w:t>Admins can edit event metadata</w:t>
+        <w:t>Admins can edit incident metadata</w:t>
       </w:r>
     </w:p>
     <w:p>
@@ -826,7 +739,7 @@
         <w:t xml:space="preserve">FR-23: </w:t>
       </w:r>
       <w:r>
-        <w:t>Admins can mark events as resolved</w:t>
+        <w:t>Admins can mark incidents as resolved</w:t>
       </w:r>
     </w:p>
     <w:p>
@@ -840,7 +753,7 @@
         <w:t xml:space="preserve">FR-24: </w:t>
       </w:r>
       <w:r>
-        <w:t>Admins can hide or delete events (super_admin only for delete)</w:t>
+        <w:t>Admins can hide or delete incidents (super_admin only for hard delete)</w:t>
       </w:r>
     </w:p>
     <w:p>
@@ -854,7 +767,7 @@
         <w:t xml:space="preserve">FR-25: </w:t>
       </w:r>
       <w:r>
-        <w:t>Filter events by category</w:t>
+        <w:t>Filter incidents by category/domain</w:t>
       </w:r>
     </w:p>
     <w:p>
@@ -868,7 +781,7 @@
         <w:t xml:space="preserve">FR-26: </w:t>
       </w:r>
       <w:r>
-        <w:t>Filter events by severity</w:t>
+        <w:t>Filter incidents by severity</w:t>
       </w:r>
     </w:p>
     <w:p>
@@ -882,7 +795,189 @@
         <w:t xml:space="preserve">FR-27: </w:t>
       </w:r>
       <w:r>
-        <w:t>Filter events by status</w:t>
+        <w:t>Filter incidents by status</w:t>
+      </w:r>
+    </w:p>
+    <w:p>
+      <w:pPr>
+        <w:pStyle w:val="ListBullet"/>
+      </w:pPr>
+      <w:r>
+        <w:rPr>
+          <w:b/>
+        </w:rPr>
+        <w:t xml:space="preserve">FR-28: </w:t>
+      </w:r>
+      <w:r>
+        <w:t>Media upload: images (WebP + thumbnail) and videos</w:t>
+      </w:r>
+    </w:p>
+    <w:p>
+      <w:pPr>
+        <w:pStyle w:val="ListBullet"/>
+      </w:pPr>
+      <w:r>
+        <w:rPr>
+          <w:b/>
+        </w:rPr>
+        <w:t xml:space="preserve">FR-29: </w:t>
+      </w:r>
+      <w:r>
+        <w:t>Polygon zone drawing with vertex editing</w:t>
+      </w:r>
+    </w:p>
+    <w:p>
+      <w:pPr>
+        <w:pStyle w:val="ListBullet"/>
+      </w:pPr>
+      <w:r>
+        <w:rPr>
+          <w:b/>
+        </w:rPr>
+        <w:t xml:space="preserve">FR-30: </w:t>
+      </w:r>
+      <w:r>
+        <w:t>Public user OAuth sign-in (Google)</w:t>
+      </w:r>
+    </w:p>
+    <w:p>
+      <w:pPr>
+        <w:pStyle w:val="ListBullet"/>
+      </w:pPr>
+      <w:r>
+        <w:rPr>
+          <w:b/>
+        </w:rPr>
+        <w:t xml:space="preserve">FR-31: </w:t>
+      </w:r>
+      <w:r>
+        <w:t>Save/bookmark incidents</w:t>
+      </w:r>
+    </w:p>
+    <w:p>
+      <w:pPr>
+        <w:pStyle w:val="ListBullet"/>
+      </w:pPr>
+      <w:r>
+        <w:rPr>
+          <w:b/>
+        </w:rPr>
+        <w:t xml:space="preserve">FR-32: </w:t>
+      </w:r>
+      <w:r>
+        <w:t>Full-text search across incidents and timelines</w:t>
+      </w:r>
+    </w:p>
+    <w:p>
+      <w:pPr>
+        <w:pStyle w:val="ListBullet"/>
+      </w:pPr>
+      <w:r>
+        <w:rPr>
+          <w:b/>
+        </w:rPr>
+        <w:t xml:space="preserve">FR-33: </w:t>
+      </w:r>
+      <w:r>
+        <w:t>Immutable audit logging for all mutations</w:t>
+      </w:r>
+    </w:p>
+    <w:p>
+      <w:pPr>
+        <w:pStyle w:val="ListBullet"/>
+      </w:pPr>
+      <w:r>
+        <w:rPr>
+          <w:b/>
+        </w:rPr>
+        <w:t xml:space="preserve">FR-34: </w:t>
+      </w:r>
+      <w:r>
+        <w:t>Superadmin user management (staff + public users)</w:t>
+      </w:r>
+    </w:p>
+    <w:p>
+      <w:pPr>
+        <w:pStyle w:val="ListBullet"/>
+      </w:pPr>
+      <w:r>
+        <w:rPr>
+          <w:b/>
+        </w:rPr>
+        <w:t xml:space="preserve">FR-35: </w:t>
+      </w:r>
+      <w:r>
+        <w:t>Public user management (ban/unban, view saved incidents)</w:t>
+      </w:r>
+    </w:p>
+    <w:p>
+      <w:pPr>
+        <w:pStyle w:val="ListBullet"/>
+      </w:pPr>
+      <w:r>
+        <w:rPr>
+          <w:b/>
+        </w:rPr>
+        <w:t xml:space="preserve">FR-36: </w:t>
+      </w:r>
+      <w:r>
+        <w:t>Shareable incident URLs with deep-linking</w:t>
+      </w:r>
+    </w:p>
+    <w:p>
+      <w:pPr>
+        <w:pStyle w:val="ListBullet"/>
+      </w:pPr>
+      <w:r>
+        <w:rPr>
+          <w:b/>
+        </w:rPr>
+        <w:t xml:space="preserve">FR-37: </w:t>
+      </w:r>
+      <w:r>
+        <w:t>Location search by place name (Nominatim)</w:t>
+      </w:r>
+    </w:p>
+    <w:p>
+      <w:pPr>
+        <w:pStyle w:val="ListBullet"/>
+      </w:pPr>
+      <w:r>
+        <w:rPr>
+          <w:b/>
+        </w:rPr>
+        <w:t xml:space="preserve">FR-38: </w:t>
+      </w:r>
+      <w:r>
+        <w:t>Coordinate parsing (DD, DDM, DMS formats)</w:t>
+      </w:r>
+    </w:p>
+    <w:p>
+      <w:pPr>
+        <w:pStyle w:val="ListBullet"/>
+      </w:pPr>
+      <w:r>
+        <w:rPr>
+          <w:b/>
+        </w:rPr>
+        <w:t xml:space="preserve">FR-39: </w:t>
+      </w:r>
+      <w:r>
+        <w:t>Smart viewport filtering (auto-switch at 100+ incidents)</w:t>
+      </w:r>
+    </w:p>
+    <w:p>
+      <w:pPr>
+        <w:pStyle w:val="ListBullet"/>
+      </w:pPr>
+      <w:r>
+        <w:rPr>
+          <w:b/>
+        </w:rPr>
+        <w:t xml:space="preserve">FR-40: </w:t>
+      </w:r>
+      <w:r>
+        <w:t>Three interface styles: Tactical, SaaS, Glassmorphism</w:t>
       </w:r>
     </w:p>
     <w:p>
@@ -918,7 +1013,7 @@
         <w:t xml:space="preserve">NFR-2: </w:t>
       </w:r>
       <w:r>
-        <w:t>Real-time updates propagate within 5 seconds (Post-MVP)</w:t>
+        <w:t>Real-time updates propagate within 5 seconds</w:t>
       </w:r>
     </w:p>
     <w:p>
@@ -1016,7 +1111,7 @@
         <w:t xml:space="preserve">NFR-9: </w:t>
       </w:r>
       <w:r>
-        <w:t>Public users cannot modify event data</w:t>
+        <w:t>Public users cannot modify incident data</w:t>
       </w:r>
     </w:p>
     <w:p>
@@ -1058,7 +1153,7 @@
         <w:t xml:space="preserve">NFR-12: </w:t>
       </w:r>
       <w:r>
-        <w:t>Event timelines maintain chronological consistency</w:t>
+        <w:t>Incident timelines maintain chronological consistency</w:t>
       </w:r>
     </w:p>
     <w:p>
@@ -1135,7 +1230,7 @@
     </w:p>
     <w:p>
       <w:r>
-        <w:t>No authentication required. Read-only access to events and timelines. Expected volume: thousands to tens of thousands.</w:t>
+        <w:t>No authentication required for browsing. Google OAuth optional for saving/bookmarking incidents. Read-only access to incidents, timelines, and sources. Expected volume: thousands to tens of thousands.</w:t>
       </w:r>
     </w:p>
     <w:p>
@@ -1148,23 +1243,20 @@
     </w:p>
     <w:p>
       <w:r>
-        <w:t>Authenticated role. Creates and manages events and updates. Limited to trusted users. Two sub-roles:</w:t>
+        <w:t>Authenticated staff role. Creates and manages incidents, timeline updates, sources, and zones. Two sub-roles: admin (create/edit) and super_admin (full access including user management).</w:t>
       </w:r>
     </w:p>
     <w:p>
       <w:pPr>
-        <w:pStyle w:val="ListBullet"/>
+        <w:pStyle w:val="Heading2"/>
       </w:pPr>
       <w:r>
-        <w:t>super_admin: Can manage other admins, full CRUD, delete events.</w:t>
+        <w:t>7.3 Superadmin / Operator</w:t>
       </w:r>
     </w:p>
     <w:p>
-      <w:pPr>
-        <w:pStyle w:val="ListBullet"/>
-      </w:pPr>
       <w:r>
-        <w:t>admin: Can create/edit events, add timeline updates, cannot manage users.</w:t>
+        <w:t>Full system access via dedicated superadmin console. Manages all users (staff and public), audit logs, domain/category taxonomy, system health monitoring, and recycle bin.</w:t>
       </w:r>
     </w:p>
     <w:p>
@@ -1185,7 +1277,7 @@
     </w:p>
     <w:p>
       <w:r>
-        <w:t>id (UUID), email, password_hash, full_name, role (super_admin/admin/viewer), is_active, created_at, updated_at</w:t>
+        <w:t>id (UUID), email, password_hash, full_name, role (super_admin/admin), is_active, last_login_at, created_at, updated_at</w:t>
       </w:r>
     </w:p>
     <w:p>
@@ -1193,12 +1285,12 @@
         <w:pStyle w:val="Heading2"/>
       </w:pPr>
       <w:r>
-        <w:t>8.2 events</w:t>
+        <w:t>8.2 public_users</w:t>
       </w:r>
     </w:p>
     <w:p>
       <w:r>
-        <w:t>id (UUID), title, description, latitude, longitude, geom (PostGIS Point), category, severity, status, start_date, end_date, created_by, created_at, updated_at, resolved_at, resolved_by</w:t>
+        <w:t>id (UUID), email, full_name, avatar_url, oauth_provider, oauth_id, is_active, created_at, updated_at</w:t>
       </w:r>
     </w:p>
     <w:p>
@@ -1206,12 +1298,12 @@
         <w:pStyle w:val="Heading2"/>
       </w:pPr>
       <w:r>
-        <w:t>8.3 event_sources</w:t>
+        <w:t>8.3 domains</w:t>
       </w:r>
     </w:p>
     <w:p>
       <w:r>
-        <w:t>id (UUID), event_id, source_type (x_post/news_article/image/video/admin_note), source_url, embed_html, media_url, description, display_order, created_by, created_at</w:t>
+        <w:t>id (SERIAL), name, slug, description, color, icon, sort_order, is_active, created_at, updated_at</w:t>
       </w:r>
     </w:p>
     <w:p>
@@ -1219,12 +1311,12 @@
         <w:pStyle w:val="Heading2"/>
       </w:pPr>
       <w:r>
-        <w:t>8.4 event_updates</w:t>
+        <w:t>8.4 categories</w:t>
       </w:r>
     </w:p>
     <w:p>
       <w:r>
-        <w:t>id (UUID), event_id, summary, update_date, created_by, created_at</w:t>
+        <w:t>id (SERIAL), domain_id (FK), name, slug, description, severity_schema (JSONB), default_severity, requires_location, requires_casualties, requires_property_damage, sort_order, is_active, created_at, updated_at</w:t>
       </w:r>
     </w:p>
     <w:p>
@@ -1232,340 +1324,126 @@
         <w:pStyle w:val="Heading2"/>
       </w:pPr>
       <w:r>
-        <w:t>8.5 zones</w:t>
+        <w:t>8.5 incidents</w:t>
       </w:r>
     </w:p>
     <w:p>
       <w:r>
-        <w:t>id (UUID), name, description, geom (PostGIS Polygon), fill_color, stroke_color, stroke_width, opacity, category, is_active, created_by, created_at, updated_at. Post-MVP feature.</w:t>
+        <w:t>id (UUID), title, description, latitude, longitude, geom (PostGIS Point), category_id (FK), severity, status, start_date, end_date, location_context, verification_override, created_by (FK), created_at, updated_at, resolved_at, resolved_by (FK)</w:t>
       </w:r>
     </w:p>
     <w:p>
       <w:pPr>
-        <w:pStyle w:val="Heading1"/>
+        <w:pStyle w:val="Heading2"/>
       </w:pPr>
       <w:r>
-        <w:t>9. Admin Dashboard Features</w:t>
-      </w:r>
-    </w:p>
-    <w:p>
-      <w:pPr>
-        <w:pStyle w:val="Heading2"/>
-      </w:pPr>
-      <w:r>
-        <w:t>9.1 MVP Features</w:t>
-      </w:r>
-    </w:p>
-    <w:p>
-      <w:pPr>
-        <w:pStyle w:val="ListBullet"/>
-      </w:pPr>
-      <w:r>
-        <w:t>Interactive map with click-to-place marker</w:t>
-      </w:r>
-    </w:p>
-    <w:p>
-      <w:pPr>
-        <w:pStyle w:val="ListBullet"/>
-      </w:pPr>
-      <w:r>
-        <w:t>Coordinate input (lat/lng) with map fly-to</w:t>
-      </w:r>
-    </w:p>
-    <w:p>
-      <w:pPr>
-        <w:pStyle w:val="ListBullet"/>
-      </w:pPr>
-      <w:r>
-        <w:t>Event creation form: title, category, severity, status, date range, description</w:t>
-      </w:r>
-    </w:p>
-    <w:p>
-      <w:pPr>
-        <w:pStyle w:val="ListBullet"/>
-      </w:pPr>
-      <w:r>
-        <w:t>Add X/Twitter post URL → auto-fetch oEmbed → store in timeline</w:t>
-      </w:r>
-    </w:p>
-    <w:p>
-      <w:pPr>
-        <w:pStyle w:val="ListBullet"/>
-      </w:pPr>
-      <w:r>
-        <w:t>Multi-admin support with role management (super_admin only)</w:t>
-      </w:r>
-    </w:p>
-    <w:p>
-      <w:pPr>
-        <w:pStyle w:val="ListBullet"/>
-      </w:pPr>
-      <w:r>
-        <w:t>Event list table with edit/resolve/hide actions</w:t>
-      </w:r>
-    </w:p>
-    <w:p>
-      <w:pPr>
-        <w:pStyle w:val="Heading2"/>
-      </w:pPr>
-      <w:r>
-        <w:t>9.2 Post-MVP Features</w:t>
-      </w:r>
-    </w:p>
-    <w:p>
-      <w:pPr>
-        <w:pStyle w:val="ListBullet"/>
-      </w:pPr>
-      <w:r>
-        <w:t>Search location by city/landmark (Nominatim geocoding)</w:t>
-      </w:r>
-    </w:p>
-    <w:p>
-      <w:pPr>
-        <w:pStyle w:val="ListBullet"/>
-      </w:pPr>
-      <w:r>
-        <w:t>Draw polygons/zones with color fills (NOTAM, red areas)</w:t>
-      </w:r>
-    </w:p>
-    <w:p>
-      <w:pPr>
-        <w:pStyle w:val="ListBullet"/>
-      </w:pPr>
-      <w:r>
-        <w:t>Direct image/video upload tabs</w:t>
-      </w:r>
-    </w:p>
-    <w:p>
-      <w:pPr>
-        <w:pStyle w:val="ListBullet"/>
-      </w:pPr>
-      <w:r>
-        <w:t>News article embeds</w:t>
-      </w:r>
-    </w:p>
-    <w:p>
-      <w:pPr>
-        <w:pStyle w:val="ListBullet"/>
-      </w:pPr>
-      <w:r>
-        <w:t>Real-time event updates via Socket.IO</w:t>
-      </w:r>
-    </w:p>
-    <w:p>
-      <w:pPr>
-        <w:pStyle w:val="ListBullet"/>
-      </w:pPr>
-      <w:r>
-        <w:t>Bulk import/export</w:t>
-      </w:r>
-    </w:p>
-    <w:p>
-      <w:pPr>
-        <w:pStyle w:val="Heading1"/>
-      </w:pPr>
-      <w:r>
-        <w:t>10. Media &amp; Source Strategy</w:t>
+        <w:t>8.6 incident_sources</w:t>
       </w:r>
     </w:p>
     <w:p>
       <w:r>
-        <w:t>MVP: External embeds only (X/Twitter oEmbed, news article links). No direct image/video uploads.</w:t>
+        <w:t>id (UUID), incident_id (FK), source_type, source_url, embed_html, media_url, description, verification_status, display_order, created_by (FK), created_at</w:t>
+      </w:r>
+    </w:p>
+    <w:p>
+      <w:pPr>
+        <w:pStyle w:val="Heading2"/>
+      </w:pPr>
+      <w:r>
+        <w:t>8.7 incident_updates</w:t>
       </w:r>
     </w:p>
     <w:p>
       <w:r>
-        <w:t>Post-MVP: Direct uploads via Cloudflare R2 or self-hosted storage.</w:t>
+        <w:t>id (UUID), incident_id (FK), summary, update_date, source_url, embed_html, created_by (FK), created_at</w:t>
+      </w:r>
+    </w:p>
+    <w:p>
+      <w:pPr>
+        <w:pStyle w:val="Heading2"/>
+      </w:pPr>
+      <w:r>
+        <w:t>8.8 incident_media</w:t>
       </w:r>
     </w:p>
     <w:p>
       <w:r>
-        <w:t>Tabbed interface in event detail: each source type appears as a separate tab.</w:t>
+        <w:t>id (UUID), incident_id (FK), original_name, stored_name, file_type, mime_type, file_size_bytes, file_url, thumbnail_url, width, height, is_processed, processing_error, display_order, uploaded_by (FK), created_at, updated_at</w:t>
       </w:r>
     </w:p>
     <w:p>
       <w:pPr>
-        <w:pStyle w:val="Heading1"/>
+        <w:pStyle w:val="Heading2"/>
       </w:pPr>
       <w:r>
-        <w:t>11. Map Strategy</w:t>
+        <w:t>8.9 zones</w:t>
       </w:r>
     </w:p>
     <w:p>
       <w:r>
-        <w:t>Self-hosted OpenStreetMap vector tiles in .mbtiles format. Served via Martin tile server. MapLibre GL JS renders tiles client-side.</w:t>
+        <w:t>id (UUID), name, description, geom (PostGIS Polygon), fill_color, stroke_color, stroke_width, opacity, category, is_active, created_by (FK), created_at, updated_at</w:t>
+      </w:r>
+    </w:p>
+    <w:p>
+      <w:pPr>
+        <w:pStyle w:val="Heading2"/>
+      </w:pPr>
+      <w:r>
+        <w:t>8.10 user_saved_incidents</w:t>
       </w:r>
     </w:p>
     <w:p>
       <w:r>
-        <w:t>No Google Maps API. No MapTiler dependency for MVP.</w:t>
+        <w:t>id (UUID), user_id (FK), incident_id (FK), notes, saved_at</w:t>
+      </w:r>
+    </w:p>
+    <w:p>
+      <w:pPr>
+        <w:pStyle w:val="Heading2"/>
+      </w:pPr>
+      <w:r>
+        <w:t>8.11 audit_logs</w:t>
       </w:r>
     </w:p>
     <w:p>
       <w:r>
-        <w:t>Map style: open-source style.json (e.g., OSM Bright) or custom-generated.</w:t>
+        <w:t>id (BIGSERIAL), user_id, user_email, action, target_type, target_id, details (JSONB), ip_address, user_agent, realm, actor_type, created_at</w:t>
       </w:r>
     </w:p>
     <w:p>
       <w:pPr>
-        <w:pStyle w:val="Heading1"/>
+        <w:pStyle w:val="Heading2"/>
       </w:pPr>
       <w:r>
-        <w:t>12. Cost Constraints</w:t>
-      </w:r>
-    </w:p>
-    <w:p>
-      <w:pPr>
-        <w:pStyle w:val="ListBullet"/>
-      </w:pPr>
-      <w:r>
-        <w:t>Development: $0 (local machine)</w:t>
-      </w:r>
-    </w:p>
-    <w:p>
-      <w:pPr>
-        <w:pStyle w:val="ListBullet"/>
-      </w:pPr>
-      <w:r>
-        <w:t>Launch: $0-10/month (Oracle Cloud Free Tier + Vercel free + domain)</w:t>
-      </w:r>
-    </w:p>
-    <w:p>
-      <w:pPr>
-        <w:pStyle w:val="ListBullet"/>
-      </w:pPr>
-      <w:r>
-        <w:t>No per-request pricing models</w:t>
-      </w:r>
-    </w:p>
-    <w:p>
-      <w:pPr>
-        <w:pStyle w:val="ListBullet"/>
-      </w:pPr>
-      <w:r>
-        <w:t>Free tiers only until revenue justifies paid plans</w:t>
-      </w:r>
-    </w:p>
-    <w:p>
-      <w:pPr>
-        <w:pStyle w:val="Heading1"/>
-      </w:pPr>
-      <w:r>
-        <w:t>13. Future Enhancements (Post-MVP)</w:t>
-      </w:r>
-    </w:p>
-    <w:p>
-      <w:pPr>
-        <w:pStyle w:val="ListBullet"/>
-      </w:pPr>
-      <w:r>
-        <w:t>Native Android app (React Native)</w:t>
-      </w:r>
-    </w:p>
-    <w:p>
-      <w:pPr>
-        <w:pStyle w:val="ListBullet"/>
-      </w:pPr>
-      <w:r>
-        <w:t>iOS support</w:t>
-      </w:r>
-    </w:p>
-    <w:p>
-      <w:pPr>
-        <w:pStyle w:val="ListBullet"/>
-      </w:pPr>
-      <w:r>
-        <w:t>Push notifications</w:t>
-      </w:r>
-    </w:p>
-    <w:p>
-      <w:pPr>
-        <w:pStyle w:val="ListBullet"/>
-      </w:pPr>
-      <w:r>
-        <w:t>User accounts and personalization</w:t>
-      </w:r>
-    </w:p>
-    <w:p>
-      <w:pPr>
-        <w:pStyle w:val="ListBullet"/>
-      </w:pPr>
-      <w:r>
-        <w:t>AI-assisted summaries</w:t>
-      </w:r>
-    </w:p>
-    <w:p>
-      <w:pPr>
-        <w:pStyle w:val="ListBullet"/>
-      </w:pPr>
-      <w:r>
-        <w:t>Advanced analytics dashboards</w:t>
-      </w:r>
-    </w:p>
-    <w:p>
-      <w:pPr>
-        <w:pStyle w:val="ListBullet"/>
-      </w:pPr>
-      <w:r>
-        <w:t>Full-text search</w:t>
-      </w:r>
-    </w:p>
-    <w:p>
-      <w:pPr>
-        <w:pStyle w:val="ListBullet"/>
-      </w:pPr>
-      <w:r>
-        <w:t>Polygon/zone drawing</w:t>
-      </w:r>
-    </w:p>
-    <w:p>
-      <w:pPr>
-        <w:pStyle w:val="ListBullet"/>
-      </w:pPr>
-      <w:r>
-        <w:t>Direct media uploads</w:t>
-      </w:r>
-    </w:p>
-    <w:p>
-      <w:pPr>
-        <w:pStyle w:val="ListBullet"/>
-      </w:pPr>
-      <w:r>
-        <w:t>Real-time Socket.IO updates</w:t>
-      </w:r>
-    </w:p>
-    <w:p>
-      <w:pPr>
-        <w:pStyle w:val="Heading1"/>
-      </w:pPr>
-      <w:r>
-        <w:t>14. Development Approach</w:t>
+        <w:t>8.12 deleted_incidents_log</w:t>
       </w:r>
     </w:p>
     <w:p>
       <w:r>
-        <w:t>This project will be built using Kimi Allegretto AI agents. Custom project templates define the architecture, database schema, API specification, and agent workflows. Generic community skills from ClawHub handle specialized tasks (UI design, code optimization, security auditing).</w:t>
+        <w:t>id (UUID), incident_id, title, deleted_by, deleted_by_email, deleted_at, data_snapshot (JSONB), purge_after</w:t>
+      </w:r>
+    </w:p>
+    <w:p>
+      <w:pPr>
+        <w:pStyle w:val="Heading1"/>
+      </w:pPr>
+      <w:r>
+        <w:t>9. API Summary</w:t>
       </w:r>
     </w:p>
     <w:p>
       <w:r>
-        <w:t>The founder manages agent tasks, reviews outputs, and handles deployment. Agents handle boilerplate code, database migrations, component generation, and testing.</w:t>
+        <w:t>Base URL: /api/v1</w:t>
       </w:r>
     </w:p>
     <w:p>
-      <w:pPr>
-        <w:pStyle w:val="Heading1"/>
-      </w:pPr>
       <w:r>
-        <w:t>15. Assumptions &amp; Dependencies</w:t>
+        <w:t>Response format: { success, data, message, error }</w:t>
       </w:r>
     </w:p>
     <w:p>
-      <w:pPr>
-        <w:pStyle w:val="ListBullet"/>
-      </w:pPr>
       <w:r>
-        <w:t>Users have internet access</w:t>
+        <w:t>Authentication: Bearer JWT token in Authorization header (SSE uses ?token= query param)</w:t>
       </w:r>
     </w:p>
     <w:p>
@@ -1573,7 +1451,13 @@
         <w:pStyle w:val="ListBullet"/>
       </w:pPr>
       <w:r>
-        <w:t>Twitter/X oEmbed endpoint remains accessible</w:t>
+        <w:rPr>
+          <w:b/>
+        </w:rPr>
+        <w:t xml:space="preserve">Auth: </w:t>
+      </w:r>
+      <w:r>
+        <w:t>/auth/login, /auth/register, /auth/me, /auth/admins, /auth/admins/:id, /auth/public/google</w:t>
       </w:r>
     </w:p>
     <w:p>
@@ -1581,7 +1465,13 @@
         <w:pStyle w:val="ListBullet"/>
       </w:pPr>
       <w:r>
-        <w:t>OpenStreetMap data is available for .mbtiles generation</w:t>
+        <w:rPr>
+          <w:b/>
+        </w:rPr>
+        <w:t xml:space="preserve">Incidents (Public): </w:t>
+      </w:r>
+      <w:r>
+        <w:t>GET /incidents, GET /incidents/search, GET /incidents/:id</w:t>
       </w:r>
     </w:p>
     <w:p>
@@ -1589,7 +1479,13 @@
         <w:pStyle w:val="ListBullet"/>
       </w:pPr>
       <w:r>
-        <w:t>Map tile provider (self-hosted Martin) remains operational</w:t>
+        <w:rPr>
+          <w:b/>
+        </w:rPr>
+        <w:t xml:space="preserve">Incidents (Admin): </w:t>
+      </w:r>
+      <w:r>
+        <w:t>POST /incidents, PATCH /incidents/:id, DELETE /incidents/:id, POST /incidents/:id/resolve, POST /incidents/:id/restore, POST /incidents/:id/purge</w:t>
       </w:r>
     </w:p>
     <w:p>
@@ -1597,7 +1493,264 @@
         <w:pStyle w:val="ListBullet"/>
       </w:pPr>
       <w:r>
-        <w:t>Development machine has sufficient resources (Ryzen 7 9700X, 32GB RAM, RTX 5070 Ti)</w:t>
+        <w:rPr>
+          <w:b/>
+        </w:rPr>
+        <w:t xml:space="preserve">Recycle Bin: </w:t>
+      </w:r>
+      <w:r>
+        <w:t>GET /incidents/deleted, GET /incidents/deleted/:id (super_admin only)</w:t>
+      </w:r>
+    </w:p>
+    <w:p>
+      <w:pPr>
+        <w:pStyle w:val="ListBullet"/>
+      </w:pPr>
+      <w:r>
+        <w:rPr>
+          <w:b/>
+        </w:rPr>
+        <w:t xml:space="preserve">Timeline: </w:t>
+      </w:r>
+      <w:r>
+        <w:t>POST /incidents/:id/timeline, PATCH /incidents/:id/timeline/:updateId, DELETE /incidents/:id/timeline/:updateId</w:t>
+      </w:r>
+    </w:p>
+    <w:p>
+      <w:pPr>
+        <w:pStyle w:val="ListBullet"/>
+      </w:pPr>
+      <w:r>
+        <w:rPr>
+          <w:b/>
+        </w:rPr>
+        <w:t xml:space="preserve">Sources: </w:t>
+      </w:r>
+      <w:r>
+        <w:t>POST /incidents/:id/sources, PATCH /incidents/:id/sources/:sourceId</w:t>
+      </w:r>
+    </w:p>
+    <w:p>
+      <w:pPr>
+        <w:pStyle w:val="ListBullet"/>
+      </w:pPr>
+      <w:r>
+        <w:rPr>
+          <w:b/>
+        </w:rPr>
+        <w:t xml:space="preserve">Media: </w:t>
+      </w:r>
+      <w:r>
+        <w:t>GET /incidents/:id/media, POST /incidents/:id/media, DELETE /incidents/:id/media/:mediaId, PATCH /incidents/:id/media/:mediaId/order</w:t>
+      </w:r>
+    </w:p>
+    <w:p>
+      <w:pPr>
+        <w:pStyle w:val="ListBullet"/>
+      </w:pPr>
+      <w:r>
+        <w:rPr>
+          <w:b/>
+        </w:rPr>
+        <w:t xml:space="preserve">Zones: </w:t>
+      </w:r>
+      <w:r>
+        <w:t>GET /zones, GET /zones/:id, GET /zones/:id/incidents, POST /zones, PATCH /zones/:id, DELETE /zones/:id</w:t>
+      </w:r>
+    </w:p>
+    <w:p>
+      <w:pPr>
+        <w:pStyle w:val="ListBullet"/>
+      </w:pPr>
+      <w:r>
+        <w:rPr>
+          <w:b/>
+        </w:rPr>
+        <w:t xml:space="preserve">Categories: </w:t>
+      </w:r>
+      <w:r>
+        <w:t>GET /categories, GET /categories/domains, GET /categories/domains/:slug</w:t>
+      </w:r>
+    </w:p>
+    <w:p>
+      <w:pPr>
+        <w:pStyle w:val="ListBullet"/>
+      </w:pPr>
+      <w:r>
+        <w:rPr>
+          <w:b/>
+        </w:rPr>
+        <w:t xml:space="preserve">Users: </w:t>
+      </w:r>
+      <w:r>
+        <w:t>GET /users, GET /users/:id, GET /users/:id/activity, PATCH /users/:id, DELETE /users/:id, POST /users/:id/reset-password</w:t>
+      </w:r>
+    </w:p>
+    <w:p>
+      <w:pPr>
+        <w:pStyle w:val="ListBullet"/>
+      </w:pPr>
+      <w:r>
+        <w:rPr>
+          <w:b/>
+        </w:rPr>
+        <w:t xml:space="preserve">Public Users: </w:t>
+      </w:r>
+      <w:r>
+        <w:t>GET /public-users, GET /public-users/:id, GET /public-users/:id/activity, PATCH /public-users/:id</w:t>
+      </w:r>
+    </w:p>
+    <w:p>
+      <w:pPr>
+        <w:pStyle w:val="ListBullet"/>
+      </w:pPr>
+      <w:r>
+        <w:rPr>
+          <w:b/>
+        </w:rPr>
+        <w:t xml:space="preserve">Saved Incidents: </w:t>
+      </w:r>
+      <w:r>
+        <w:t>GET /incidents/saved, POST /incidents/:id/save, DELETE /incidents/:id/save</w:t>
+      </w:r>
+    </w:p>
+    <w:p>
+      <w:pPr>
+        <w:pStyle w:val="ListBullet"/>
+      </w:pPr>
+      <w:r>
+        <w:rPr>
+          <w:b/>
+        </w:rPr>
+        <w:t xml:space="preserve">Audit: </w:t>
+      </w:r>
+      <w:r>
+        <w:t>GET /audit, GET /audit/summary</w:t>
+      </w:r>
+    </w:p>
+    <w:p>
+      <w:pPr>
+        <w:pStyle w:val="ListBullet"/>
+      </w:pPr>
+      <w:r>
+        <w:rPr>
+          <w:b/>
+        </w:rPr>
+        <w:t xml:space="preserve">System: </w:t>
+      </w:r>
+      <w:r>
+        <w:t>GET /system/health</w:t>
+      </w:r>
+    </w:p>
+    <w:p>
+      <w:pPr>
+        <w:pStyle w:val="ListBullet"/>
+      </w:pPr>
+      <w:r>
+        <w:rPr>
+          <w:b/>
+        </w:rPr>
+        <w:t xml:space="preserve">SSE: </w:t>
+      </w:r>
+      <w:r>
+        <w:t>GET /incidents/stream (authenticated)</w:t>
+      </w:r>
+    </w:p>
+    <w:p>
+      <w:pPr>
+        <w:pStyle w:val="Heading1"/>
+      </w:pPr>
+      <w:r>
+        <w:t>10. File Storage</w:t>
+      </w:r>
+    </w:p>
+    <w:p>
+      <w:r>
+        <w:t>Development: Files stored on local disk (./uploads/) via abstracted storage interface. Production: Flip STORAGE_PROVIDER=r2 env var — same code, Cloudflare R2 backend. Postgres stores only metadata URLs — no blobs in the database.</w:t>
+      </w:r>
+    </w:p>
+    <w:p>
+      <w:pPr>
+        <w:pStyle w:val="Heading1"/>
+      </w:pPr>
+      <w:r>
+        <w:t>11. Design System</w:t>
+      </w:r>
+    </w:p>
+    <w:p>
+      <w:r>
+        <w:t>Brand: Crimson Seal — deep maroon accent (#9f1239) on near-black (#050505).</w:t>
+      </w:r>
+    </w:p>
+    <w:p>
+      <w:r>
+        <w:t>Font: Space Grotesk (headlines + body), JetBrains Mono (data/monospace).</w:t>
+      </w:r>
+    </w:p>
+    <w:p>
+      <w:r>
+        <w:t>Three interface styles: Tactical (default), SaaS, Glassmorphism.</w:t>
+      </w:r>
+    </w:p>
+    <w:p>
+      <w:r>
+        <w:t>Light + dark themes supported via CSS variables and data-theme attribute.</w:t>
+      </w:r>
+    </w:p>
+    <w:p>
+      <w:pPr>
+        <w:pStyle w:val="Heading1"/>
+      </w:pPr>
+      <w:r>
+        <w:t>12. Known Limitations &amp; Future Work</w:t>
+      </w:r>
+    </w:p>
+    <w:p>
+      <w:pPr>
+        <w:pStyle w:val="ListBullet"/>
+      </w:pPr>
+      <w:r>
+        <w:t>Video processing is pass-through only (no ffmpeg compression yet)</w:t>
+      </w:r>
+    </w:p>
+    <w:p>
+      <w:pPr>
+        <w:pStyle w:val="ListBullet"/>
+      </w:pPr>
+      <w:r>
+        <w:t>Marker clustering not yet implemented (Supercluster post-MVP)</w:t>
+      </w:r>
+    </w:p>
+    <w:p>
+      <w:pPr>
+        <w:pStyle w:val="ListBullet"/>
+      </w:pPr>
+      <w:r>
+        <w:t>Heatmap layer not yet implemented</w:t>
+      </w:r>
+    </w:p>
+    <w:p>
+      <w:pPr>
+        <w:pStyle w:val="ListBullet"/>
+      </w:pPr>
+      <w:r>
+        <w:t>Mobile responsiveness is basic (desktop-primary)</w:t>
+      </w:r>
+    </w:p>
+    <w:p>
+      <w:pPr>
+        <w:pStyle w:val="ListBullet"/>
+      </w:pPr>
+      <w:r>
+        <w:t>MapLibre JS chunk &gt;500KB (code-splitting post-MVP)</w:t>
+      </w:r>
+    </w:p>
+    <w:p>
+      <w:pPr>
+        <w:pStyle w:val="ListBullet"/>
+      </w:pPr>
+      <w:r>
+        <w:t>Self-hosted fonts future enhancement (currently using MapLibre CDN)</w:t>
       </w:r>
     </w:p>
     <w:sectPr>

</xml_diff>